<commit_message>
update sop for file naming, and readme to include build instructions
</commit_message>
<xml_diff>
--- a/SOPs/file_naming_SOP.docx
+++ b/SOPs/file_naming_SOP.docx
@@ -10,6 +10,7 @@
           <w:numId w:val="0"/>
         </w:numPr>
         <w:spacing w:lineRule="auto" w:line="240" w:beforeAutospacing="1" w:afterAutospacing="1"/>
+        <w:ind w:hanging="0" w:left="0"/>
         <w:outlineLvl w:val="1"/>
         <w:rPr>
           <w:rFonts w:ascii="Times New Roman" w:hAnsi="Times New Roman" w:cs="Times New Roman"/>
@@ -60,6 +61,7 @@
           <w:numId w:val="0"/>
         </w:numPr>
         <w:spacing w:lineRule="auto" w:line="240" w:beforeAutospacing="1" w:afterAutospacing="1"/>
+        <w:ind w:hanging="0" w:left="0"/>
         <w:outlineLvl w:val="2"/>
         <w:rPr>
           <w:rFonts w:ascii="Times New Roman" w:hAnsi="Times New Roman" w:eastAsia="Times New Roman" w:cs="Times New Roman"/>
@@ -81,19 +83,7 @@
           <w:szCs w:val="27"/>
           <w14:ligatures w14:val="none"/>
         </w:rPr>
-        <w:t xml:space="preserve">TITLE: </w:t>
-      </w:r>
-      <w:r>
-        <w:rPr>
-          <w:rFonts w:eastAsia="Times New Roman" w:cs="Times New Roman" w:ascii="Times New Roman" w:hAnsi="Times New Roman"/>
-          <w:b/>
-          <w:bCs/>
-          <w:kern w:val="0"/>
-          <w:sz w:val="27"/>
-          <w:szCs w:val="27"/>
-          <w14:ligatures w14:val="none"/>
-        </w:rPr>
-        <w:t xml:space="preserve">Acquiring images, </w:t>
+        <w:t xml:space="preserve">TITLE: Acquiring images, </w:t>
       </w:r>
     </w:p>
     <w:p>
@@ -168,6 +158,7 @@
           <w:numId w:val="0"/>
         </w:numPr>
         <w:spacing w:lineRule="auto" w:line="240" w:beforeAutospacing="1" w:afterAutospacing="1"/>
+        <w:ind w:hanging="0" w:left="0"/>
         <w:outlineLvl w:val="2"/>
         <w:rPr>
           <w:rFonts w:ascii="Times New Roman" w:hAnsi="Times New Roman" w:cs="Times New Roman"/>
@@ -226,15 +217,7 @@
           <w:kern w:val="0"/>
           <w14:ligatures w14:val="none"/>
         </w:rPr>
-        <w:t xml:space="preserve">To provide a standardized procedure for </w:t>
-      </w:r>
-      <w:r>
-        <w:rPr>
-          <w:rFonts w:cs="Times New Roman" w:ascii="Times New Roman" w:hAnsi="Times New Roman"/>
-          <w:kern w:val="0"/>
-          <w14:ligatures w14:val="none"/>
-        </w:rPr>
-        <w:t xml:space="preserve">saving, naming and sending image information from Malaria testing protocols. </w:t>
+        <w:t xml:space="preserve">To provide a standardized procedure for saving, naming and sending image information from Malaria testing protocols. </w:t>
       </w:r>
     </w:p>
     <w:p>
@@ -309,6 +292,7 @@
           <w:numId w:val="0"/>
         </w:numPr>
         <w:spacing w:lineRule="auto" w:line="240" w:beforeAutospacing="1" w:afterAutospacing="1"/>
+        <w:ind w:hanging="0" w:left="0"/>
         <w:outlineLvl w:val="2"/>
         <w:rPr>
           <w:rFonts w:ascii="Times New Roman" w:hAnsi="Times New Roman" w:cs="Times New Roman"/>
@@ -367,39 +351,7 @@
           <w:kern w:val="0"/>
           <w14:ligatures w14:val="none"/>
         </w:rPr>
-        <w:t xml:space="preserve">This SOP applies to all Medical Laboratory Scientists </w:t>
-      </w:r>
-      <w:r>
-        <w:rPr>
-          <w:rFonts w:cs="Times New Roman" w:ascii="Times New Roman" w:hAnsi="Times New Roman"/>
-          <w:kern w:val="0"/>
-          <w14:ligatures w14:val="none"/>
-        </w:rPr>
-        <w:t>and</w:t>
-      </w:r>
-      <w:r>
-        <w:rPr>
-          <w:rFonts w:cs="Times New Roman" w:ascii="Times New Roman" w:hAnsi="Times New Roman"/>
-          <w:kern w:val="0"/>
-          <w14:ligatures w14:val="none"/>
-        </w:rPr>
-        <w:t xml:space="preserve"> Technicians involved in </w:t>
-      </w:r>
-      <w:r>
-        <w:rPr>
-          <w:rFonts w:cs="Times New Roman" w:ascii="Times New Roman" w:hAnsi="Times New Roman"/>
-          <w:kern w:val="0"/>
-          <w14:ligatures w14:val="none"/>
-        </w:rPr>
-        <w:t>acquiring images with YAMM (Yet Another Malaria Microscope) for Malaria detection in the pilot study ran at Damaturu</w:t>
-      </w:r>
-      <w:r>
-        <w:rPr>
-          <w:rFonts w:cs="Times New Roman" w:ascii="Times New Roman" w:hAnsi="Times New Roman"/>
-          <w:kern w:val="0"/>
-          <w14:ligatures w14:val="none"/>
-        </w:rPr>
-        <w:t>.</w:t>
+        <w:t>This SOP applies to all Medical Laboratory Scientists and Technicians involved in acquiring images with YAMM (Yet Another Malaria Microscope) for Malaria detection in the pilot study ran at Damaturu.</w:t>
       </w:r>
     </w:p>
     <w:p>
@@ -474,6 +426,7 @@
           <w:numId w:val="0"/>
         </w:numPr>
         <w:spacing w:lineRule="auto" w:line="240" w:beforeAutospacing="1" w:afterAutospacing="1"/>
+        <w:ind w:hanging="0" w:left="0"/>
         <w:outlineLvl w:val="2"/>
         <w:rPr>
           <w:rFonts w:ascii="Times New Roman" w:hAnsi="Times New Roman" w:cs="Times New Roman"/>
@@ -518,15 +471,7 @@
           <w:kern w:val="0"/>
           <w14:ligatures w14:val="none"/>
         </w:rPr>
-        <w:t xml:space="preserve">Laboratory Scientists/Technicians: </w:t>
-      </w:r>
-      <w:r>
-        <w:rPr>
-          <w:rFonts w:cs="Times New Roman" w:ascii="Times New Roman" w:hAnsi="Times New Roman"/>
-          <w:kern w:val="0"/>
-          <w14:ligatures w14:val="none"/>
-        </w:rPr>
-        <w:t>Data aquisition (focused images), naming and transmission.</w:t>
+        <w:t>Laboratory Scientists/Technicians: Data aquisition (focused images), naming and transmission.</w:t>
       </w:r>
     </w:p>
     <w:p>
@@ -624,6 +569,7 @@
           <w:numId w:val="0"/>
         </w:numPr>
         <w:spacing w:lineRule="auto" w:line="240" w:beforeAutospacing="1" w:afterAutospacing="1"/>
+        <w:ind w:hanging="0" w:left="0"/>
         <w:outlineLvl w:val="2"/>
         <w:rPr>
           <w:rFonts w:ascii="Times New Roman" w:hAnsi="Times New Roman" w:cs="Times New Roman"/>
@@ -682,23 +628,7 @@
           <w:kern w:val="0"/>
           <w14:ligatures w14:val="none"/>
         </w:rPr>
-        <w:t xml:space="preserve">To be able to track the spread of Malaria, its sazonality and its demographics, we need a curated database with collected samples </w:t>
-      </w:r>
-      <w:r>
-        <w:rPr>
-          <w:rFonts w:cs="Times New Roman" w:ascii="Times New Roman" w:hAnsi="Times New Roman"/>
-          <w:kern w:val="0"/>
-          <w14:ligatures w14:val="none"/>
-        </w:rPr>
-        <w:t>for cross checking and validation.</w:t>
-      </w:r>
-      <w:r>
-        <w:rPr>
-          <w:rFonts w:cs="Times New Roman" w:ascii="Times New Roman" w:hAnsi="Times New Roman"/>
-          <w:kern w:val="0"/>
-          <w14:ligatures w14:val="none"/>
-        </w:rPr>
-        <w:t xml:space="preserve"> </w:t>
+        <w:t xml:space="preserve">To be able to track the spread of Malaria, its sazonality and its demographics, we need a curated database with collected samples for cross checking and validation. </w:t>
       </w:r>
     </w:p>
     <w:p>
@@ -761,7 +691,7 @@
           <w:ilvl w:val="0"/>
           <w:numId w:val="2"/>
         </w:numPr>
-        <w:spacing w:lineRule="auto" w:line="240" w:beforeAutospacing="1" w:afterAutospacing="1"/>
+        <w:spacing w:lineRule="auto" w:line="240" w:beforeAutospacing="1" w:after="0"/>
         <w:outlineLvl w:val="2"/>
         <w:rPr>
           <w:rFonts w:ascii="Times New Roman" w:hAnsi="Times New Roman"/>
@@ -785,7 +715,7 @@
           <w:ilvl w:val="0"/>
           <w:numId w:val="2"/>
         </w:numPr>
-        <w:spacing w:lineRule="auto" w:line="240" w:beforeAutospacing="1" w:afterAutospacing="1"/>
+        <w:spacing w:lineRule="auto" w:line="240" w:before="0" w:after="0"/>
         <w:outlineLvl w:val="2"/>
         <w:rPr>
           <w:rFonts w:ascii="Times New Roman" w:hAnsi="Times New Roman"/>
@@ -809,7 +739,7 @@
           <w:ilvl w:val="0"/>
           <w:numId w:val="2"/>
         </w:numPr>
-        <w:spacing w:lineRule="auto" w:line="240" w:beforeAutospacing="1" w:afterAutospacing="1"/>
+        <w:spacing w:lineRule="auto" w:line="240" w:before="0" w:after="0"/>
         <w:outlineLvl w:val="2"/>
         <w:rPr>
           <w:rFonts w:ascii="Times New Roman" w:hAnsi="Times New Roman"/>
@@ -833,7 +763,7 @@
           <w:ilvl w:val="0"/>
           <w:numId w:val="2"/>
         </w:numPr>
-        <w:spacing w:lineRule="auto" w:line="240" w:beforeAutospacing="1" w:afterAutospacing="1"/>
+        <w:spacing w:lineRule="auto" w:line="240" w:before="0" w:after="0"/>
         <w:outlineLvl w:val="2"/>
         <w:rPr>
           <w:rFonts w:ascii="Times New Roman" w:hAnsi="Times New Roman"/>
@@ -857,7 +787,31 @@
           <w:ilvl w:val="0"/>
           <w:numId w:val="2"/>
         </w:numPr>
-        <w:spacing w:lineRule="auto" w:line="240" w:beforeAutospacing="1" w:afterAutospacing="1"/>
+        <w:spacing w:lineRule="auto" w:line="240" w:before="0" w:after="0"/>
+        <w:outlineLvl w:val="2"/>
+        <w:rPr>
+          <w:rFonts w:ascii="Times New Roman" w:hAnsi="Times New Roman"/>
+          <w:b w:val="false"/>
+          <w:bCs w:val="false"/>
+        </w:rPr>
+      </w:pPr>
+      <w:r>
+        <w:rPr>
+          <w:rFonts w:ascii="Times New Roman" w:hAnsi="Times New Roman"/>
+          <w:b w:val="false"/>
+          <w:bCs w:val="false"/>
+        </w:rPr>
+        <w:t>pregnancy</w:t>
+      </w:r>
+    </w:p>
+    <w:p>
+      <w:pPr>
+        <w:pStyle w:val="Normal"/>
+        <w:numPr>
+          <w:ilvl w:val="0"/>
+          <w:numId w:val="2"/>
+        </w:numPr>
+        <w:spacing w:lineRule="auto" w:line="240" w:before="0" w:after="0"/>
         <w:outlineLvl w:val="2"/>
         <w:rPr>
           <w:rFonts w:ascii="Times New Roman" w:hAnsi="Times New Roman"/>
@@ -881,7 +835,7 @@
           <w:ilvl w:val="0"/>
           <w:numId w:val="2"/>
         </w:numPr>
-        <w:spacing w:lineRule="auto" w:line="240" w:beforeAutospacing="1" w:afterAutospacing="1"/>
+        <w:spacing w:lineRule="auto" w:line="240" w:before="0" w:after="0"/>
         <w:outlineLvl w:val="2"/>
         <w:rPr>
           <w:rFonts w:ascii="Times New Roman" w:hAnsi="Times New Roman"/>
@@ -905,7 +859,7 @@
           <w:ilvl w:val="0"/>
           <w:numId w:val="2"/>
         </w:numPr>
-        <w:spacing w:lineRule="auto" w:line="240" w:beforeAutospacing="1" w:afterAutospacing="1"/>
+        <w:spacing w:lineRule="auto" w:line="240" w:before="0" w:afterAutospacing="1"/>
         <w:outlineLvl w:val="2"/>
         <w:rPr>
           <w:rFonts w:ascii="Times New Roman" w:hAnsi="Times New Roman"/>
@@ -955,9 +909,7 @@
         </w:rPr>
       </w:pPr>
       <w:r>
-        <w:rPr>
-          <w:rFonts w:ascii="Times New Roman" w:hAnsi="Times New Roman"/>
-        </w:rPr>
+        <w:rPr/>
         <mc:AlternateContent>
           <mc:Choice Requires="wps">
             <w:drawing>
@@ -1018,6 +970,7 @@
           <w:numId w:val="0"/>
         </w:numPr>
         <w:spacing w:lineRule="auto" w:line="240" w:beforeAutospacing="1" w:afterAutospacing="1"/>
+        <w:ind w:hanging="0" w:left="0"/>
         <w:outlineLvl w:val="2"/>
         <w:rPr>
           <w:rFonts w:ascii="Times New Roman" w:hAnsi="Times New Roman"/>
@@ -1033,8 +986,43 @@
           <w:szCs w:val="27"/>
           <w14:ligatures w14:val="none"/>
         </w:rPr>
-        <w:t>5</w:t>
-      </w:r>
+        <w:t>5. METHOD</w:t>
+      </w:r>
+    </w:p>
+    <w:p>
+      <w:pPr>
+        <w:pStyle w:val="Normal"/>
+        <w:numPr>
+          <w:ilvl w:val="0"/>
+          <w:numId w:val="0"/>
+        </w:numPr>
+        <w:spacing w:lineRule="auto" w:line="240" w:beforeAutospacing="1" w:afterAutospacing="1"/>
+        <w:ind w:hanging="0" w:left="0"/>
+        <w:outlineLvl w:val="2"/>
+        <w:rPr>
+          <w:rFonts w:ascii="Times New Roman" w:hAnsi="Times New Roman"/>
+        </w:rPr>
+      </w:pPr>
+      <w:r>
+        <w:rPr>
+          <w:rFonts w:ascii="Times New Roman" w:hAnsi="Times New Roman"/>
+        </w:rPr>
+      </w:r>
+    </w:p>
+    <w:p>
+      <w:pPr>
+        <w:pStyle w:val="Normal"/>
+        <w:numPr>
+          <w:ilvl w:val="0"/>
+          <w:numId w:val="0"/>
+        </w:numPr>
+        <w:spacing w:lineRule="auto" w:line="240" w:beforeAutospacing="1" w:afterAutospacing="1"/>
+        <w:ind w:hanging="0" w:left="0"/>
+        <w:outlineLvl w:val="2"/>
+        <w:rPr>
+          <w:rFonts w:ascii="Times New Roman" w:hAnsi="Times New Roman"/>
+        </w:rPr>
+      </w:pPr>
       <w:r>
         <w:rPr>
           <w:rFonts w:eastAsia="Times New Roman" w:cs="Times New Roman" w:ascii="Times New Roman" w:hAnsi="Times New Roman"/>
@@ -1045,8 +1033,700 @@
           <w:szCs w:val="27"/>
           <w14:ligatures w14:val="none"/>
         </w:rPr>
-        <w:t xml:space="preserve">. </w:t>
-      </w:r>
+        <w:t>5.1 Aquiring images at PHCCs</w:t>
+      </w:r>
+    </w:p>
+    <w:p>
+      <w:pPr>
+        <w:pStyle w:val="Normal"/>
+        <w:numPr>
+          <w:ilvl w:val="0"/>
+          <w:numId w:val="0"/>
+        </w:numPr>
+        <w:spacing w:lineRule="auto" w:line="240" w:beforeAutospacing="1" w:afterAutospacing="1"/>
+        <w:ind w:hanging="0" w:left="0"/>
+        <w:outlineLvl w:val="2"/>
+        <w:rPr>
+          <w:rFonts w:eastAsia="Times New Roman" w:cs="Times New Roman"/>
+          <w:b/>
+          <w:bCs/>
+          <w:kern w:val="0"/>
+          <w:sz w:val="27"/>
+          <w:szCs w:val="27"/>
+          <w14:ligatures w14:val="none"/>
+        </w:rPr>
+      </w:pPr>
+      <w:r>
+        <w:rPr>
+          <w:rFonts w:eastAsia="Times New Roman" w:cs="Times New Roman"/>
+          <w:b/>
+          <w:bCs/>
+          <w:kern w:val="0"/>
+          <w:sz w:val="27"/>
+          <w:szCs w:val="27"/>
+          <w14:ligatures w14:val="none"/>
+        </w:rPr>
+      </w:r>
+    </w:p>
+    <w:p>
+      <w:pPr>
+        <w:pStyle w:val="Normal"/>
+        <w:numPr>
+          <w:ilvl w:val="0"/>
+          <w:numId w:val="0"/>
+        </w:numPr>
+        <w:spacing w:lineRule="auto" w:line="240" w:beforeAutospacing="1" w:afterAutospacing="1"/>
+        <w:ind w:hanging="0" w:left="0"/>
+        <w:outlineLvl w:val="2"/>
+        <w:rPr>
+          <w:rFonts w:ascii="Times New Roman" w:hAnsi="Times New Roman"/>
+          <w:b w:val="false"/>
+          <w:bCs w:val="false"/>
+        </w:rPr>
+      </w:pPr>
+      <w:r>
+        <w:rPr>
+          <w:rFonts w:ascii="Times New Roman" w:hAnsi="Times New Roman"/>
+          <w:b w:val="false"/>
+          <w:bCs w:val="false"/>
+        </w:rPr>
+        <w:t xml:space="preserve">Once diagnosis is made, use the app function to take a photo. Make sure that the system is configured to the highest possible resolution (this should be the default when you open the app). The photo should be saved directly to your phone gallery. Once the photo has been taken, it can be shared with your supervisor via messaging app (whatsapp). </w:t>
+      </w:r>
+    </w:p>
+    <w:p>
+      <w:pPr>
+        <w:pStyle w:val="Normal"/>
+        <w:numPr>
+          <w:ilvl w:val="0"/>
+          <w:numId w:val="0"/>
+        </w:numPr>
+        <w:spacing w:lineRule="auto" w:line="240" w:beforeAutospacing="1" w:afterAutospacing="1"/>
+        <w:ind w:hanging="0" w:left="0"/>
+        <w:outlineLvl w:val="2"/>
+        <w:rPr>
+          <w:rFonts w:ascii="Times New Roman" w:hAnsi="Times New Roman"/>
+          <w:b w:val="false"/>
+          <w:bCs w:val="false"/>
+        </w:rPr>
+      </w:pPr>
+      <w:r>
+        <w:rPr>
+          <w:rFonts w:ascii="Times New Roman" w:hAnsi="Times New Roman"/>
+          <w:b w:val="false"/>
+          <w:bCs w:val="false"/>
+        </w:rPr>
+      </w:r>
+    </w:p>
+    <w:p>
+      <w:pPr>
+        <w:pStyle w:val="Normal"/>
+        <w:numPr>
+          <w:ilvl w:val="0"/>
+          <w:numId w:val="0"/>
+        </w:numPr>
+        <w:spacing w:lineRule="auto" w:line="240" w:beforeAutospacing="1" w:afterAutospacing="1"/>
+        <w:ind w:hanging="0" w:left="0"/>
+        <w:outlineLvl w:val="2"/>
+        <w:rPr>
+          <w:rFonts w:ascii="Times New Roman" w:hAnsi="Times New Roman"/>
+          <w:b w:val="false"/>
+          <w:bCs w:val="false"/>
+        </w:rPr>
+      </w:pPr>
+      <w:r>
+        <w:rPr>
+          <w:rFonts w:ascii="Times New Roman" w:hAnsi="Times New Roman"/>
+          <w:b w:val="false"/>
+          <w:bCs w:val="false"/>
+        </w:rPr>
+        <w:t>If you are using whatsapp, make sure to select the “HD” button before sharing. Once the photo has been shared, send a message with information about the photo, in the following format:</w:t>
+      </w:r>
+    </w:p>
+    <w:p>
+      <w:pPr>
+        <w:pStyle w:val="Normal"/>
+        <w:numPr>
+          <w:ilvl w:val="0"/>
+          <w:numId w:val="0"/>
+        </w:numPr>
+        <w:spacing w:lineRule="auto" w:line="240" w:beforeAutospacing="1" w:afterAutospacing="1"/>
+        <w:ind w:hanging="0" w:left="0"/>
+        <w:outlineLvl w:val="2"/>
+        <w:rPr>
+          <w:rFonts w:ascii="Times New Roman" w:hAnsi="Times New Roman"/>
+          <w:b w:val="false"/>
+          <w:bCs w:val="false"/>
+        </w:rPr>
+      </w:pPr>
+      <w:r>
+        <w:rPr>
+          <w:rFonts w:ascii="Times New Roman" w:hAnsi="Times New Roman"/>
+          <w:b w:val="false"/>
+          <w:bCs w:val="false"/>
+        </w:rPr>
+      </w:r>
+    </w:p>
+    <w:p>
+      <w:pPr>
+        <w:pStyle w:val="Normal"/>
+        <w:numPr>
+          <w:ilvl w:val="0"/>
+          <w:numId w:val="0"/>
+        </w:numPr>
+        <w:spacing w:lineRule="auto" w:line="240" w:beforeAutospacing="1" w:afterAutospacing="1"/>
+        <w:ind w:hanging="0" w:left="0"/>
+        <w:outlineLvl w:val="2"/>
+        <w:rPr>
+          <w:rFonts w:ascii="Times New Roman" w:hAnsi="Times New Roman"/>
+          <w:b w:val="false"/>
+          <w:bCs w:val="false"/>
+        </w:rPr>
+      </w:pPr>
+      <w:r>
+        <w:rPr>
+          <w:rFonts w:ascii="Times New Roman" w:hAnsi="Times New Roman"/>
+          <w:b w:val="false"/>
+          <w:bCs w:val="false"/>
+        </w:rPr>
+        <w:t>datewithyearfirst_PHCCID_gender</w:t>
+      </w:r>
+      <w:r>
+        <w:rPr>
+          <w:rFonts w:ascii="Times New Roman" w:hAnsi="Times New Roman"/>
+          <w:b w:val="false"/>
+          <w:bCs w:val="false"/>
+        </w:rPr>
+        <w:t>_pregnancy</w:t>
+      </w:r>
+      <w:r>
+        <w:rPr>
+          <w:rFonts w:ascii="Times New Roman" w:hAnsi="Times New Roman"/>
+          <w:b w:val="false"/>
+          <w:bCs w:val="false"/>
+        </w:rPr>
+        <w:t>_age_microscopediagnosis_rapidtestdiagnosis_smearmakeruse</w:t>
+      </w:r>
+    </w:p>
+    <w:p>
+      <w:pPr>
+        <w:pStyle w:val="Normal"/>
+        <w:numPr>
+          <w:ilvl w:val="0"/>
+          <w:numId w:val="0"/>
+        </w:numPr>
+        <w:spacing w:lineRule="auto" w:line="240" w:beforeAutospacing="1" w:afterAutospacing="1"/>
+        <w:ind w:hanging="0" w:left="0"/>
+        <w:outlineLvl w:val="2"/>
+        <w:rPr>
+          <w:rFonts w:ascii="Times New Roman" w:hAnsi="Times New Roman"/>
+          <w:b w:val="false"/>
+          <w:bCs w:val="false"/>
+        </w:rPr>
+      </w:pPr>
+      <w:r>
+        <w:rPr>
+          <w:rFonts w:ascii="Times New Roman" w:hAnsi="Times New Roman"/>
+          <w:b w:val="false"/>
+          <w:bCs w:val="false"/>
+        </w:rPr>
+      </w:r>
+    </w:p>
+    <w:p>
+      <w:pPr>
+        <w:pStyle w:val="Normal"/>
+        <w:numPr>
+          <w:ilvl w:val="0"/>
+          <w:numId w:val="0"/>
+        </w:numPr>
+        <w:spacing w:lineRule="auto" w:line="240" w:beforeAutospacing="1" w:afterAutospacing="1"/>
+        <w:ind w:hanging="0" w:left="0"/>
+        <w:outlineLvl w:val="2"/>
+        <w:rPr>
+          <w:rFonts w:ascii="Times New Roman" w:hAnsi="Times New Roman"/>
+          <w:b w:val="false"/>
+          <w:bCs w:val="false"/>
+        </w:rPr>
+      </w:pPr>
+      <w:r>
+        <w:rPr>
+          <w:rFonts w:ascii="Times New Roman" w:hAnsi="Times New Roman"/>
+          <w:b w:val="false"/>
+          <w:bCs w:val="false"/>
+        </w:rPr>
+        <w:t>One example below, where on Jan 25</w:t>
+      </w:r>
+      <w:r>
+        <w:rPr>
+          <w:rFonts w:ascii="Times New Roman" w:hAnsi="Times New Roman"/>
+          <w:b w:val="false"/>
+          <w:bCs w:val="false"/>
+          <w:vertAlign w:val="superscript"/>
+        </w:rPr>
+        <w:t>th</w:t>
+      </w:r>
+      <w:r>
+        <w:rPr>
+          <w:rFonts w:ascii="Times New Roman" w:hAnsi="Times New Roman"/>
+          <w:b w:val="false"/>
+          <w:bCs w:val="false"/>
+        </w:rPr>
+        <w:t xml:space="preserve"> 2026 at Gwange PHCC, a test was made with microscopy, using a smear maker, and RDT was also made. Patient was female, </w:t>
+      </w:r>
+      <w:r>
+        <w:rPr>
+          <w:rFonts w:ascii="Times New Roman" w:hAnsi="Times New Roman"/>
+          <w:b w:val="false"/>
+          <w:bCs w:val="false"/>
+        </w:rPr>
+        <w:t>35</w:t>
+      </w:r>
+      <w:r>
+        <w:rPr>
+          <w:rFonts w:ascii="Times New Roman" w:hAnsi="Times New Roman"/>
+          <w:b w:val="false"/>
+          <w:bCs w:val="false"/>
+        </w:rPr>
+        <w:t xml:space="preserve"> years old, </w:t>
+      </w:r>
+      <w:r>
+        <w:rPr>
+          <w:rFonts w:ascii="Times New Roman" w:hAnsi="Times New Roman"/>
+          <w:b w:val="false"/>
+          <w:bCs w:val="false"/>
+        </w:rPr>
+        <w:t>pregnant, not smoker</w:t>
+      </w:r>
+    </w:p>
+    <w:p>
+      <w:pPr>
+        <w:pStyle w:val="Normal"/>
+        <w:numPr>
+          <w:ilvl w:val="0"/>
+          <w:numId w:val="0"/>
+        </w:numPr>
+        <w:spacing w:lineRule="auto" w:line="240" w:beforeAutospacing="1" w:afterAutospacing="1"/>
+        <w:ind w:hanging="0" w:left="0"/>
+        <w:outlineLvl w:val="2"/>
+        <w:rPr>
+          <w:rFonts w:ascii="Times New Roman" w:hAnsi="Times New Roman"/>
+          <w:b w:val="false"/>
+          <w:bCs w:val="false"/>
+        </w:rPr>
+      </w:pPr>
+      <w:r>
+        <w:rPr>
+          <w:rFonts w:ascii="Times New Roman" w:hAnsi="Times New Roman"/>
+          <w:b w:val="false"/>
+          <w:bCs w:val="false"/>
+        </w:rPr>
+        <w:t xml:space="preserve"> </w:t>
+      </w:r>
+    </w:p>
+    <w:p>
+      <w:pPr>
+        <w:pStyle w:val="Normal"/>
+        <w:numPr>
+          <w:ilvl w:val="0"/>
+          <w:numId w:val="0"/>
+        </w:numPr>
+        <w:spacing w:lineRule="auto" w:line="240" w:beforeAutospacing="1" w:afterAutospacing="1"/>
+        <w:ind w:hanging="0" w:left="0"/>
+        <w:outlineLvl w:val="2"/>
+        <w:rPr>
+          <w:rFonts w:ascii="Times New Roman" w:hAnsi="Times New Roman"/>
+          <w:b w:val="false"/>
+          <w:bCs w:val="false"/>
+        </w:rPr>
+      </w:pPr>
+      <w:r>
+        <w:rPr>
+          <w:rFonts w:ascii="Times New Roman" w:hAnsi="Times New Roman"/>
+          <w:b w:val="false"/>
+          <w:bCs w:val="false"/>
+        </w:rPr>
+        <w:t>The filename to be send together with the photo is to your subgroup WhatsApp:</w:t>
+      </w:r>
+    </w:p>
+    <w:p>
+      <w:pPr>
+        <w:pStyle w:val="Normal"/>
+        <w:numPr>
+          <w:ilvl w:val="0"/>
+          <w:numId w:val="0"/>
+        </w:numPr>
+        <w:spacing w:lineRule="auto" w:line="240" w:beforeAutospacing="1" w:afterAutospacing="1"/>
+        <w:ind w:hanging="0" w:left="0"/>
+        <w:outlineLvl w:val="2"/>
+        <w:rPr>
+          <w:rFonts w:ascii="Times New Roman" w:hAnsi="Times New Roman"/>
+          <w:b w:val="false"/>
+          <w:bCs w:val="false"/>
+        </w:rPr>
+      </w:pPr>
+      <w:r>
+        <w:rPr>
+          <w:rFonts w:ascii="Times New Roman" w:hAnsi="Times New Roman"/>
+          <w:b w:val="false"/>
+          <w:bCs w:val="false"/>
+        </w:rPr>
+      </w:r>
+    </w:p>
+    <w:p>
+      <w:pPr>
+        <w:pStyle w:val="Normal"/>
+        <w:numPr>
+          <w:ilvl w:val="0"/>
+          <w:numId w:val="0"/>
+        </w:numPr>
+        <w:spacing w:lineRule="auto" w:line="240" w:beforeAutospacing="1" w:afterAutospacing="1"/>
+        <w:ind w:hanging="0" w:left="0"/>
+        <w:outlineLvl w:val="2"/>
+        <w:rPr>
+          <w:rFonts w:ascii="Times New Roman" w:hAnsi="Times New Roman"/>
+          <w:b w:val="false"/>
+          <w:bCs w:val="false"/>
+        </w:rPr>
+      </w:pPr>
+      <w:r>
+        <w:rPr>
+          <w:rFonts w:ascii="Times New Roman" w:hAnsi="Times New Roman"/>
+          <w:b w:val="false"/>
+          <w:bCs w:val="false"/>
+        </w:rPr>
+        <w:t>“</w:t>
+      </w:r>
+      <w:r>
+        <w:rPr>
+          <w:rFonts w:ascii="Times New Roman" w:hAnsi="Times New Roman"/>
+          <w:b w:val="false"/>
+          <w:bCs w:val="false"/>
+        </w:rPr>
+        <w:t>20260125_Gwange_F</w:t>
+      </w:r>
+      <w:r>
+        <w:rPr>
+          <w:rFonts w:ascii="Times New Roman" w:hAnsi="Times New Roman"/>
+          <w:b w:val="false"/>
+          <w:bCs w:val="false"/>
+        </w:rPr>
+        <w:t>_preg_nonsmoker</w:t>
+      </w:r>
+      <w:r>
+        <w:rPr>
+          <w:rFonts w:ascii="Times New Roman" w:hAnsi="Times New Roman"/>
+          <w:b w:val="false"/>
+          <w:bCs w:val="false"/>
+        </w:rPr>
+        <w:t>_45_mpositive_rdtnegative_yesmaker”</w:t>
+      </w:r>
+    </w:p>
+    <w:p>
+      <w:pPr>
+        <w:pStyle w:val="Normal"/>
+        <w:numPr>
+          <w:ilvl w:val="0"/>
+          <w:numId w:val="0"/>
+        </w:numPr>
+        <w:spacing w:lineRule="auto" w:line="240" w:beforeAutospacing="1" w:afterAutospacing="1"/>
+        <w:ind w:hanging="0" w:left="0"/>
+        <w:outlineLvl w:val="2"/>
+        <w:rPr>
+          <w:rFonts w:ascii="Times New Roman" w:hAnsi="Times New Roman"/>
+          <w:b w:val="false"/>
+          <w:bCs w:val="false"/>
+        </w:rPr>
+      </w:pPr>
+      <w:r>
+        <w:rPr>
+          <w:rFonts w:ascii="Times New Roman" w:hAnsi="Times New Roman"/>
+          <w:b w:val="false"/>
+          <w:bCs w:val="false"/>
+        </w:rPr>
+        <w:t>a</w:t>
+      </w:r>
+      <w:r>
+        <w:rPr>
+          <w:rFonts w:ascii="Times New Roman" w:hAnsi="Times New Roman"/>
+          <w:b w:val="false"/>
+          <w:bCs w:val="false"/>
+        </w:rPr>
+        <w:t>nother</w:t>
+      </w:r>
+      <w:r>
+        <w:rPr>
+          <w:rFonts w:ascii="Times New Roman" w:hAnsi="Times New Roman"/>
+          <w:b w:val="false"/>
+          <w:bCs w:val="false"/>
+        </w:rPr>
+        <w:t xml:space="preserve"> example below, where on Jan 2</w:t>
+      </w:r>
+      <w:r>
+        <w:rPr>
+          <w:rFonts w:ascii="Times New Roman" w:hAnsi="Times New Roman"/>
+          <w:b w:val="false"/>
+          <w:bCs w:val="false"/>
+        </w:rPr>
+        <w:t>8</w:t>
+      </w:r>
+      <w:r>
+        <w:rPr>
+          <w:rFonts w:ascii="Times New Roman" w:hAnsi="Times New Roman"/>
+          <w:b w:val="false"/>
+          <w:bCs w:val="false"/>
+          <w:vertAlign w:val="superscript"/>
+        </w:rPr>
+        <w:t>th</w:t>
+      </w:r>
+      <w:r>
+        <w:rPr>
+          <w:rFonts w:ascii="Times New Roman" w:hAnsi="Times New Roman"/>
+          <w:b w:val="false"/>
+          <w:bCs w:val="false"/>
+        </w:rPr>
+        <w:t xml:space="preserve"> 2026 at </w:t>
+      </w:r>
+      <w:r>
+        <w:rPr>
+          <w:rFonts w:ascii="Times New Roman" w:hAnsi="Times New Roman"/>
+          <w:b w:val="false"/>
+          <w:bCs w:val="false"/>
+        </w:rPr>
+        <w:t>Gambir</w:t>
+      </w:r>
+      <w:r>
+        <w:rPr>
+          <w:rFonts w:ascii="Times New Roman" w:hAnsi="Times New Roman"/>
+          <w:b w:val="false"/>
+          <w:bCs w:val="false"/>
+        </w:rPr>
+        <w:t xml:space="preserve"> PHCC, a test was made with microscopy, using a smear maker, and RDT was also made. Patient was </w:t>
+      </w:r>
+      <w:r>
+        <w:rPr>
+          <w:rFonts w:ascii="Times New Roman" w:hAnsi="Times New Roman"/>
+          <w:b w:val="false"/>
+          <w:bCs w:val="false"/>
+        </w:rPr>
+        <w:t>M</w:t>
+      </w:r>
+      <w:r>
+        <w:rPr>
+          <w:rFonts w:ascii="Times New Roman" w:hAnsi="Times New Roman"/>
+          <w:b w:val="false"/>
+          <w:bCs w:val="false"/>
+        </w:rPr>
+        <w:t xml:space="preserve">ale, </w:t>
+      </w:r>
+      <w:r>
+        <w:rPr>
+          <w:rFonts w:ascii="Times New Roman" w:hAnsi="Times New Roman"/>
+          <w:b w:val="false"/>
+          <w:bCs w:val="false"/>
+        </w:rPr>
+        <w:t>55</w:t>
+      </w:r>
+      <w:r>
+        <w:rPr>
+          <w:rFonts w:ascii="Times New Roman" w:hAnsi="Times New Roman"/>
+          <w:b w:val="false"/>
+          <w:bCs w:val="false"/>
+        </w:rPr>
+        <w:t xml:space="preserve"> years old, </w:t>
+      </w:r>
+      <w:r>
+        <w:rPr>
+          <w:rFonts w:ascii="Times New Roman" w:hAnsi="Times New Roman"/>
+          <w:b w:val="false"/>
+          <w:bCs w:val="false"/>
+        </w:rPr>
+        <w:t>not pregnant and smoker</w:t>
+      </w:r>
+    </w:p>
+    <w:p>
+      <w:pPr>
+        <w:pStyle w:val="Normal"/>
+        <w:numPr>
+          <w:ilvl w:val="0"/>
+          <w:numId w:val="0"/>
+        </w:numPr>
+        <w:spacing w:lineRule="auto" w:line="240" w:beforeAutospacing="1" w:afterAutospacing="1"/>
+        <w:ind w:hanging="0" w:left="0"/>
+        <w:outlineLvl w:val="2"/>
+        <w:rPr>
+          <w:rFonts w:ascii="Times New Roman" w:hAnsi="Times New Roman"/>
+        </w:rPr>
+      </w:pPr>
+      <w:r>
+        <w:rPr>
+          <w:rFonts w:ascii="Times New Roman" w:hAnsi="Times New Roman"/>
+          <w:b w:val="false"/>
+          <w:bCs w:val="false"/>
+        </w:rPr>
+        <w:t xml:space="preserve"> </w:t>
+      </w:r>
+    </w:p>
+    <w:p>
+      <w:pPr>
+        <w:pStyle w:val="Normal"/>
+        <w:numPr>
+          <w:ilvl w:val="0"/>
+          <w:numId w:val="0"/>
+        </w:numPr>
+        <w:spacing w:lineRule="auto" w:line="240" w:beforeAutospacing="1" w:afterAutospacing="1"/>
+        <w:ind w:hanging="0" w:left="0"/>
+        <w:outlineLvl w:val="2"/>
+        <w:rPr>
+          <w:rFonts w:ascii="Times New Roman" w:hAnsi="Times New Roman"/>
+        </w:rPr>
+      </w:pPr>
+      <w:r>
+        <w:rPr>
+          <w:rFonts w:ascii="Times New Roman" w:hAnsi="Times New Roman"/>
+          <w:b w:val="false"/>
+          <w:bCs w:val="false"/>
+        </w:rPr>
+        <w:t>The filename to be send together with the photo is to your subgroup WhatsApp:</w:t>
+      </w:r>
+    </w:p>
+    <w:p>
+      <w:pPr>
+        <w:pStyle w:val="Normal"/>
+        <w:numPr>
+          <w:ilvl w:val="0"/>
+          <w:numId w:val="0"/>
+        </w:numPr>
+        <w:spacing w:lineRule="auto" w:line="240" w:beforeAutospacing="1" w:afterAutospacing="1"/>
+        <w:ind w:hanging="0" w:left="0"/>
+        <w:outlineLvl w:val="2"/>
+        <w:rPr>
+          <w:rFonts w:ascii="Times New Roman" w:hAnsi="Times New Roman"/>
+          <w:b w:val="false"/>
+          <w:bCs w:val="false"/>
+        </w:rPr>
+      </w:pPr>
+      <w:r>
+        <w:rPr>
+          <w:rFonts w:ascii="Times New Roman" w:hAnsi="Times New Roman"/>
+          <w:b w:val="false"/>
+          <w:bCs w:val="false"/>
+        </w:rPr>
+      </w:r>
+    </w:p>
+    <w:p>
+      <w:pPr>
+        <w:pStyle w:val="Normal"/>
+        <w:numPr>
+          <w:ilvl w:val="0"/>
+          <w:numId w:val="0"/>
+        </w:numPr>
+        <w:spacing w:lineRule="auto" w:line="240" w:beforeAutospacing="1" w:afterAutospacing="1"/>
+        <w:ind w:hanging="0" w:left="0"/>
+        <w:outlineLvl w:val="2"/>
+        <w:rPr>
+          <w:rFonts w:ascii="Times New Roman" w:hAnsi="Times New Roman"/>
+        </w:rPr>
+      </w:pPr>
+      <w:r>
+        <w:rPr>
+          <w:rFonts w:ascii="Times New Roman" w:hAnsi="Times New Roman"/>
+        </w:rPr>
+        <w:t>“</w:t>
+      </w:r>
+      <w:r>
+        <w:rPr>
+          <w:rFonts w:ascii="Times New Roman" w:hAnsi="Times New Roman"/>
+        </w:rPr>
+        <w:t>20260125_G</w:t>
+      </w:r>
+      <w:r>
+        <w:rPr>
+          <w:rFonts w:ascii="Times New Roman" w:hAnsi="Times New Roman"/>
+        </w:rPr>
+        <w:t>ambir</w:t>
+      </w:r>
+      <w:r>
+        <w:rPr>
+          <w:rFonts w:ascii="Times New Roman" w:hAnsi="Times New Roman"/>
+        </w:rPr>
+        <w:t>_</w:t>
+      </w:r>
+      <w:r>
+        <w:rPr>
+          <w:rFonts w:ascii="Times New Roman" w:hAnsi="Times New Roman"/>
+        </w:rPr>
+        <w:t>M_notpreg_smoker</w:t>
+      </w:r>
+      <w:r>
+        <w:rPr>
+          <w:rFonts w:ascii="Times New Roman" w:hAnsi="Times New Roman"/>
+        </w:rPr>
+        <w:t>_</w:t>
+      </w:r>
+      <w:r>
+        <w:rPr>
+          <w:rFonts w:ascii="Times New Roman" w:hAnsi="Times New Roman"/>
+        </w:rPr>
+        <w:t>5</w:t>
+      </w:r>
+      <w:r>
+        <w:rPr>
+          <w:rFonts w:ascii="Times New Roman" w:hAnsi="Times New Roman"/>
+        </w:rPr>
+        <w:t>5_m</w:t>
+      </w:r>
+      <w:r>
+        <w:rPr>
+          <w:rFonts w:ascii="Times New Roman" w:hAnsi="Times New Roman"/>
+        </w:rPr>
+        <w:t>negative</w:t>
+      </w:r>
+      <w:r>
+        <w:rPr>
+          <w:rFonts w:ascii="Times New Roman" w:hAnsi="Times New Roman"/>
+        </w:rPr>
+        <w:t>_rdtnegative_yesmaker”</w:t>
+      </w:r>
+    </w:p>
+    <w:p>
+      <w:pPr>
+        <w:pStyle w:val="Normal"/>
+        <w:numPr>
+          <w:ilvl w:val="0"/>
+          <w:numId w:val="0"/>
+        </w:numPr>
+        <w:spacing w:lineRule="auto" w:line="240" w:beforeAutospacing="1" w:afterAutospacing="1"/>
+        <w:ind w:hanging="0" w:left="0"/>
+        <w:outlineLvl w:val="2"/>
+        <w:rPr>
+          <w:rFonts w:ascii="Times New Roman" w:hAnsi="Times New Roman"/>
+          <w:b w:val="false"/>
+          <w:bCs w:val="false"/>
+        </w:rPr>
+      </w:pPr>
+      <w:r>
+        <w:rPr>
+          <w:rFonts w:ascii="Times New Roman" w:hAnsi="Times New Roman"/>
+          <w:b w:val="false"/>
+          <w:bCs w:val="false"/>
+        </w:rPr>
+      </w:r>
+    </w:p>
+    <w:p>
+      <w:pPr>
+        <w:pStyle w:val="Normal"/>
+        <w:numPr>
+          <w:ilvl w:val="0"/>
+          <w:numId w:val="0"/>
+        </w:numPr>
+        <w:spacing w:lineRule="auto" w:line="240" w:beforeAutospacing="1" w:afterAutospacing="1"/>
+        <w:ind w:hanging="0" w:left="0"/>
+        <w:outlineLvl w:val="2"/>
+        <w:rPr>
+          <w:rFonts w:ascii="Times New Roman" w:hAnsi="Times New Roman"/>
+          <w:b/>
+          <w:bCs/>
+        </w:rPr>
+      </w:pPr>
       <w:r>
         <w:rPr>
           <w:rFonts w:eastAsia="Times New Roman" w:cs="Times New Roman" w:ascii="Times New Roman" w:hAnsi="Times New Roman"/>
@@ -1057,599 +1737,258 @@
           <w:szCs w:val="27"/>
           <w14:ligatures w14:val="none"/>
         </w:rPr>
-        <w:t>METHOD</w:t>
-      </w:r>
-    </w:p>
-    <w:p>
-      <w:pPr>
-        <w:pStyle w:val="Normal"/>
-        <w:numPr>
-          <w:ilvl w:val="0"/>
-          <w:numId w:val="0"/>
-        </w:numPr>
-        <w:spacing w:lineRule="auto" w:line="240" w:beforeAutospacing="1" w:afterAutospacing="1"/>
-        <w:outlineLvl w:val="2"/>
-        <w:rPr>
-          <w:rFonts w:ascii="Times New Roman" w:hAnsi="Times New Roman"/>
-        </w:rPr>
-      </w:pPr>
-      <w:r>
-        <w:rPr>
-          <w:rFonts w:ascii="Times New Roman" w:hAnsi="Times New Roman"/>
-        </w:rPr>
-      </w:r>
-    </w:p>
-    <w:p>
-      <w:pPr>
-        <w:pStyle w:val="Normal"/>
-        <w:numPr>
-          <w:ilvl w:val="0"/>
-          <w:numId w:val="0"/>
-        </w:numPr>
-        <w:spacing w:lineRule="auto" w:line="240" w:beforeAutospacing="1" w:afterAutospacing="1"/>
-        <w:outlineLvl w:val="2"/>
-        <w:rPr>
-          <w:rFonts w:ascii="Times New Roman" w:hAnsi="Times New Roman"/>
-        </w:rPr>
-      </w:pPr>
-      <w:r>
-        <w:rPr>
-          <w:rFonts w:eastAsia="Times New Roman" w:cs="Times New Roman" w:ascii="Times New Roman" w:hAnsi="Times New Roman"/>
-          <w:b/>
-          <w:bCs/>
+        <w:t>5.2 Transferring images aquired to Gdrive</w:t>
+      </w:r>
+    </w:p>
+    <w:p>
+      <w:pPr>
+        <w:pStyle w:val="Normal"/>
+        <w:numPr>
+          <w:ilvl w:val="0"/>
+          <w:numId w:val="0"/>
+        </w:numPr>
+        <w:spacing w:lineRule="auto" w:line="240" w:beforeAutospacing="1" w:afterAutospacing="1"/>
+        <w:ind w:hanging="0" w:left="0"/>
+        <w:outlineLvl w:val="2"/>
+        <w:rPr>
+          <w:rFonts w:eastAsia="Times New Roman" w:cs="Times New Roman"/>
           <w:kern w:val="0"/>
           <w:sz w:val="27"/>
           <w:szCs w:val="27"/>
           <w14:ligatures w14:val="none"/>
         </w:rPr>
-        <w:t>5</w:t>
-      </w:r>
-      <w:r>
-        <w:rPr>
-          <w:rFonts w:eastAsia="Times New Roman" w:cs="Times New Roman" w:ascii="Times New Roman" w:hAnsi="Times New Roman"/>
-          <w:b/>
-          <w:bCs/>
+      </w:pPr>
+      <w:r>
+        <w:rPr>
+          <w:rFonts w:eastAsia="Times New Roman" w:cs="Times New Roman"/>
           <w:kern w:val="0"/>
           <w:sz w:val="27"/>
           <w:szCs w:val="27"/>
           <w14:ligatures w14:val="none"/>
         </w:rPr>
-        <w:t>.</w:t>
-      </w:r>
+      </w:r>
+    </w:p>
+    <w:p>
+      <w:pPr>
+        <w:pStyle w:val="Normal"/>
+        <w:numPr>
+          <w:ilvl w:val="0"/>
+          <w:numId w:val="0"/>
+        </w:numPr>
+        <w:spacing w:lineRule="auto" w:line="240" w:beforeAutospacing="1" w:afterAutospacing="1"/>
+        <w:ind w:hanging="0" w:left="0"/>
+        <w:outlineLvl w:val="2"/>
+        <w:rPr>
+          <w:rFonts w:ascii="Times New Roman" w:hAnsi="Times New Roman"/>
+          <w:b w:val="false"/>
+          <w:bCs w:val="false"/>
+        </w:rPr>
+      </w:pPr>
       <w:r>
         <w:rPr>
           <w:rFonts w:eastAsia="Times New Roman" w:cs="Times New Roman" w:ascii="Times New Roman" w:hAnsi="Times New Roman"/>
-          <w:b/>
-          <w:bCs/>
+          <w:b w:val="false"/>
+          <w:bCs w:val="false"/>
           <w:kern w:val="0"/>
           <w:sz w:val="27"/>
           <w:szCs w:val="27"/>
           <w14:ligatures w14:val="none"/>
         </w:rPr>
-        <w:t>1</w:t>
-      </w:r>
-      <w:r>
-        <w:rPr>
-          <w:rFonts w:eastAsia="Times New Roman" w:cs="Times New Roman" w:ascii="Times New Roman" w:hAnsi="Times New Roman"/>
-          <w:b/>
-          <w:bCs/>
+        <w:t>At this pilot stage we are adding images to a GoogleDrive folder, to serve as an initial database. For this to happen in a useful way the following steps are responsibility of the group leaders:</w:t>
+      </w:r>
+    </w:p>
+    <w:p>
+      <w:pPr>
+        <w:pStyle w:val="Normal"/>
+        <w:numPr>
+          <w:ilvl w:val="0"/>
+          <w:numId w:val="0"/>
+        </w:numPr>
+        <w:spacing w:lineRule="auto" w:line="240" w:beforeAutospacing="1" w:afterAutospacing="1"/>
+        <w:ind w:hanging="0" w:left="0"/>
+        <w:outlineLvl w:val="2"/>
+        <w:rPr>
+          <w:rFonts w:eastAsia="Times New Roman" w:cs="Times New Roman"/>
           <w:kern w:val="0"/>
           <w:sz w:val="27"/>
           <w:szCs w:val="27"/>
           <w14:ligatures w14:val="none"/>
         </w:rPr>
-        <w:t xml:space="preserve"> </w:t>
-      </w:r>
-      <w:r>
-        <w:rPr>
-          <w:rFonts w:eastAsia="Times New Roman" w:cs="Times New Roman" w:ascii="Times New Roman" w:hAnsi="Times New Roman"/>
-          <w:b/>
-          <w:bCs/>
+      </w:pPr>
+      <w:r>
+        <w:rPr>
+          <w:rFonts w:eastAsia="Times New Roman" w:cs="Times New Roman"/>
           <w:kern w:val="0"/>
           <w:sz w:val="27"/>
           <w:szCs w:val="27"/>
           <w14:ligatures w14:val="none"/>
         </w:rPr>
-        <w:t>Aquiring images at PHCCs</w:t>
-      </w:r>
-    </w:p>
-    <w:p>
-      <w:pPr>
-        <w:pStyle w:val="Normal"/>
-        <w:numPr>
-          <w:ilvl w:val="0"/>
-          <w:numId w:val="0"/>
-        </w:numPr>
-        <w:spacing w:lineRule="auto" w:line="240" w:beforeAutospacing="1" w:afterAutospacing="1"/>
-        <w:outlineLvl w:val="2"/>
-        <w:rPr>
-          <w:rFonts w:eastAsia="Times New Roman" w:cs="Times New Roman"/>
-          <w:b/>
-          <w:bCs/>
+      </w:r>
+    </w:p>
+    <w:p>
+      <w:pPr>
+        <w:pStyle w:val="Normal"/>
+        <w:numPr>
+          <w:ilvl w:val="0"/>
+          <w:numId w:val="0"/>
+        </w:numPr>
+        <w:spacing w:lineRule="auto" w:line="240" w:beforeAutospacing="1" w:afterAutospacing="1"/>
+        <w:ind w:hanging="0" w:left="0"/>
+        <w:outlineLvl w:val="2"/>
+        <w:rPr>
+          <w:rFonts w:ascii="Times New Roman" w:hAnsi="Times New Roman"/>
+          <w:b w:val="false"/>
+          <w:bCs w:val="false"/>
+        </w:rPr>
+      </w:pPr>
+      <w:r>
+        <w:rPr>
+          <w:rFonts w:eastAsia="Times New Roman" w:cs="Times New Roman" w:ascii="Times New Roman" w:hAnsi="Times New Roman"/>
+          <w:b w:val="false"/>
+          <w:bCs w:val="false"/>
           <w:kern w:val="0"/>
           <w:sz w:val="27"/>
           <w:szCs w:val="27"/>
           <w14:ligatures w14:val="none"/>
         </w:rPr>
-      </w:pPr>
-      <w:r>
-        <w:rPr>
-          <w:rFonts w:ascii="Times New Roman" w:hAnsi="Times New Roman"/>
-        </w:rPr>
-      </w:r>
-    </w:p>
-    <w:p>
-      <w:pPr>
-        <w:pStyle w:val="Normal"/>
-        <w:numPr>
-          <w:ilvl w:val="0"/>
-          <w:numId w:val="0"/>
-        </w:numPr>
-        <w:spacing w:lineRule="auto" w:line="240" w:beforeAutospacing="1" w:afterAutospacing="1"/>
-        <w:outlineLvl w:val="2"/>
-        <w:rPr>
-          <w:rFonts w:ascii="Times New Roman" w:hAnsi="Times New Roman"/>
-          <w:b w:val="false"/>
-          <w:bCs w:val="false"/>
-        </w:rPr>
-      </w:pPr>
-      <w:r>
-        <w:rPr>
-          <w:rFonts w:ascii="Times New Roman" w:hAnsi="Times New Roman"/>
-          <w:b w:val="false"/>
-          <w:bCs w:val="false"/>
-        </w:rPr>
-        <w:t xml:space="preserve">Once diagnosis is made, use the app function to take a photo. Make sure that the system is configured to the highest possible resolution (this should be the default when you open the app). The photo should be saved directly to your phone gallery. Once the photo has been taken, it can be shared with your supervisor via messaging app (whatsapp). </w:t>
-      </w:r>
-    </w:p>
-    <w:p>
-      <w:pPr>
-        <w:pStyle w:val="Normal"/>
-        <w:numPr>
-          <w:ilvl w:val="0"/>
-          <w:numId w:val="0"/>
-        </w:numPr>
-        <w:spacing w:lineRule="auto" w:line="240" w:beforeAutospacing="1" w:afterAutospacing="1"/>
-        <w:outlineLvl w:val="2"/>
-        <w:rPr>
-          <w:rFonts w:ascii="Times New Roman" w:hAnsi="Times New Roman"/>
-          <w:b w:val="false"/>
-          <w:bCs w:val="false"/>
-        </w:rPr>
-      </w:pPr>
-      <w:r>
-        <w:rPr>
-          <w:rFonts w:ascii="Times New Roman" w:hAnsi="Times New Roman"/>
-          <w:b w:val="false"/>
-          <w:bCs w:val="false"/>
-        </w:rPr>
-      </w:r>
-    </w:p>
-    <w:p>
-      <w:pPr>
-        <w:pStyle w:val="Normal"/>
-        <w:numPr>
-          <w:ilvl w:val="0"/>
-          <w:numId w:val="0"/>
-        </w:numPr>
-        <w:spacing w:lineRule="auto" w:line="240" w:beforeAutospacing="1" w:afterAutospacing="1"/>
-        <w:outlineLvl w:val="2"/>
-        <w:rPr>
-          <w:rFonts w:ascii="Times New Roman" w:hAnsi="Times New Roman"/>
-          <w:b w:val="false"/>
-          <w:bCs w:val="false"/>
-        </w:rPr>
-      </w:pPr>
-      <w:r>
-        <w:rPr>
-          <w:rFonts w:ascii="Times New Roman" w:hAnsi="Times New Roman"/>
-          <w:b w:val="false"/>
-          <w:bCs w:val="false"/>
-        </w:rPr>
-        <w:t>If you are using whatsapp, make sure to select the “HD” button before sharing. Once the photo has been shared, send a message with information about the photo, in the following format:</w:t>
-      </w:r>
-    </w:p>
-    <w:p>
-      <w:pPr>
-        <w:pStyle w:val="Normal"/>
-        <w:numPr>
-          <w:ilvl w:val="0"/>
-          <w:numId w:val="0"/>
-        </w:numPr>
-        <w:spacing w:lineRule="auto" w:line="240" w:beforeAutospacing="1" w:afterAutospacing="1"/>
-        <w:outlineLvl w:val="2"/>
-        <w:rPr>
-          <w:rFonts w:ascii="Times New Roman" w:hAnsi="Times New Roman"/>
-          <w:b w:val="false"/>
-          <w:bCs w:val="false"/>
-        </w:rPr>
-      </w:pPr>
-      <w:r>
-        <w:rPr>
-          <w:rFonts w:ascii="Times New Roman" w:hAnsi="Times New Roman"/>
-          <w:b w:val="false"/>
-          <w:bCs w:val="false"/>
-        </w:rPr>
-      </w:r>
-    </w:p>
-    <w:p>
-      <w:pPr>
-        <w:pStyle w:val="Normal"/>
-        <w:numPr>
-          <w:ilvl w:val="0"/>
-          <w:numId w:val="0"/>
-        </w:numPr>
-        <w:spacing w:lineRule="auto" w:line="240" w:beforeAutospacing="1" w:afterAutospacing="1"/>
-        <w:outlineLvl w:val="2"/>
-        <w:rPr>
-          <w:rFonts w:ascii="Times New Roman" w:hAnsi="Times New Roman"/>
-          <w:b w:val="false"/>
-          <w:bCs w:val="false"/>
-        </w:rPr>
-      </w:pPr>
-      <w:r>
-        <w:rPr>
-          <w:rFonts w:ascii="Times New Roman" w:hAnsi="Times New Roman"/>
-          <w:b w:val="false"/>
-          <w:bCs w:val="false"/>
-        </w:rPr>
-        <w:t>datewithyearfirst</w:t>
-      </w:r>
-      <w:r>
-        <w:rPr>
-          <w:rFonts w:ascii="Times New Roman" w:hAnsi="Times New Roman"/>
-          <w:b w:val="false"/>
-          <w:bCs w:val="false"/>
-        </w:rPr>
-        <w:t>_</w:t>
-      </w:r>
-      <w:r>
-        <w:rPr>
-          <w:rFonts w:ascii="Times New Roman" w:hAnsi="Times New Roman"/>
-          <w:b w:val="false"/>
-          <w:bCs w:val="false"/>
-        </w:rPr>
-        <w:t>PHCCID</w:t>
-      </w:r>
-      <w:r>
-        <w:rPr>
-          <w:rFonts w:ascii="Times New Roman" w:hAnsi="Times New Roman"/>
-          <w:b w:val="false"/>
-          <w:bCs w:val="false"/>
-        </w:rPr>
-        <w:t>_</w:t>
-      </w:r>
-      <w:r>
-        <w:rPr>
-          <w:rFonts w:ascii="Times New Roman" w:hAnsi="Times New Roman"/>
-          <w:b w:val="false"/>
-          <w:bCs w:val="false"/>
-        </w:rPr>
-        <w:t>gender_age_microscopediagnosis</w:t>
-      </w:r>
-      <w:r>
-        <w:rPr>
-          <w:rFonts w:ascii="Times New Roman" w:hAnsi="Times New Roman"/>
-          <w:b w:val="false"/>
-          <w:bCs w:val="false"/>
-        </w:rPr>
-        <w:t>_</w:t>
-      </w:r>
-      <w:r>
-        <w:rPr>
-          <w:rFonts w:ascii="Times New Roman" w:hAnsi="Times New Roman"/>
-          <w:b w:val="false"/>
-          <w:bCs w:val="false"/>
-        </w:rPr>
-        <w:t>rapidtestdiagnosis_smearmakeruse</w:t>
-      </w:r>
-    </w:p>
-    <w:p>
-      <w:pPr>
-        <w:pStyle w:val="Normal"/>
-        <w:numPr>
-          <w:ilvl w:val="0"/>
-          <w:numId w:val="0"/>
-        </w:numPr>
-        <w:spacing w:lineRule="auto" w:line="240" w:beforeAutospacing="1" w:afterAutospacing="1"/>
-        <w:outlineLvl w:val="2"/>
-        <w:rPr>
-          <w:rFonts w:ascii="Times New Roman" w:hAnsi="Times New Roman"/>
-          <w:b w:val="false"/>
-          <w:bCs w:val="false"/>
-        </w:rPr>
-      </w:pPr>
-      <w:r>
-        <w:rPr>
-          <w:rFonts w:ascii="Times New Roman" w:hAnsi="Times New Roman"/>
-          <w:b w:val="false"/>
-          <w:bCs w:val="false"/>
-        </w:rPr>
-      </w:r>
-    </w:p>
-    <w:p>
-      <w:pPr>
-        <w:pStyle w:val="Normal"/>
-        <w:numPr>
-          <w:ilvl w:val="0"/>
-          <w:numId w:val="0"/>
-        </w:numPr>
-        <w:spacing w:lineRule="auto" w:line="240" w:beforeAutospacing="1" w:afterAutospacing="1"/>
-        <w:outlineLvl w:val="2"/>
-        <w:rPr>
-          <w:rFonts w:ascii="Times New Roman" w:hAnsi="Times New Roman"/>
-          <w:b w:val="false"/>
-          <w:bCs w:val="false"/>
-        </w:rPr>
-      </w:pPr>
-      <w:r>
-        <w:rPr>
-          <w:rFonts w:ascii="Times New Roman" w:hAnsi="Times New Roman"/>
-          <w:b w:val="false"/>
-          <w:bCs w:val="false"/>
-        </w:rPr>
-        <w:t xml:space="preserve">One example below, </w:t>
-      </w:r>
-      <w:r>
-        <w:rPr>
-          <w:rFonts w:ascii="Times New Roman" w:hAnsi="Times New Roman"/>
-          <w:b w:val="false"/>
-          <w:bCs w:val="false"/>
-        </w:rPr>
-        <w:t>where on Jan 25</w:t>
-      </w:r>
-      <w:r>
-        <w:rPr>
-          <w:rFonts w:ascii="Times New Roman" w:hAnsi="Times New Roman"/>
-          <w:b w:val="false"/>
-          <w:bCs w:val="false"/>
-          <w:vertAlign w:val="superscript"/>
-        </w:rPr>
-        <w:t>th</w:t>
-      </w:r>
-      <w:r>
-        <w:rPr>
-          <w:rFonts w:ascii="Times New Roman" w:hAnsi="Times New Roman"/>
-          <w:b w:val="false"/>
-          <w:bCs w:val="false"/>
-        </w:rPr>
-        <w:t xml:space="preserve"> 2026 at Gwange PHCC, a test was made with microscopy, using a smear maker, and RDT was also made. Patient was female, 45 years old</w:t>
-      </w:r>
-    </w:p>
-    <w:p>
-      <w:pPr>
-        <w:pStyle w:val="Normal"/>
-        <w:numPr>
-          <w:ilvl w:val="0"/>
-          <w:numId w:val="0"/>
-        </w:numPr>
-        <w:spacing w:lineRule="auto" w:line="240" w:beforeAutospacing="1" w:afterAutospacing="1"/>
-        <w:outlineLvl w:val="2"/>
-        <w:rPr>
-          <w:rFonts w:ascii="Times New Roman" w:hAnsi="Times New Roman"/>
-          <w:b w:val="false"/>
-          <w:bCs w:val="false"/>
-        </w:rPr>
-      </w:pPr>
-      <w:r>
-        <w:rPr>
-          <w:rFonts w:ascii="Times New Roman" w:hAnsi="Times New Roman"/>
-          <w:b w:val="false"/>
-          <w:bCs w:val="false"/>
-        </w:rPr>
-        <w:t xml:space="preserve"> </w:t>
-      </w:r>
-    </w:p>
-    <w:p>
-      <w:pPr>
-        <w:pStyle w:val="Normal"/>
-        <w:numPr>
-          <w:ilvl w:val="0"/>
-          <w:numId w:val="0"/>
-        </w:numPr>
-        <w:spacing w:lineRule="auto" w:line="240" w:beforeAutospacing="1" w:afterAutospacing="1"/>
-        <w:outlineLvl w:val="2"/>
-        <w:rPr>
-          <w:rFonts w:ascii="Times New Roman" w:hAnsi="Times New Roman"/>
-          <w:b w:val="false"/>
-          <w:bCs w:val="false"/>
-        </w:rPr>
-      </w:pPr>
-      <w:r>
-        <w:rPr>
-          <w:rFonts w:ascii="Times New Roman" w:hAnsi="Times New Roman"/>
-          <w:b w:val="false"/>
-          <w:bCs w:val="false"/>
-        </w:rPr>
-        <w:t>The filename to be send together with the photo is to your subgroup WhatsApp:</w:t>
-      </w:r>
-    </w:p>
-    <w:p>
-      <w:pPr>
-        <w:pStyle w:val="Normal"/>
-        <w:numPr>
-          <w:ilvl w:val="0"/>
-          <w:numId w:val="0"/>
-        </w:numPr>
-        <w:spacing w:lineRule="auto" w:line="240" w:beforeAutospacing="1" w:afterAutospacing="1"/>
-        <w:outlineLvl w:val="2"/>
-        <w:rPr>
-          <w:rFonts w:ascii="Times New Roman" w:hAnsi="Times New Roman"/>
-          <w:b w:val="false"/>
-          <w:bCs w:val="false"/>
-        </w:rPr>
-      </w:pPr>
-      <w:r>
-        <w:rPr>
-          <w:rFonts w:ascii="Times New Roman" w:hAnsi="Times New Roman"/>
-          <w:b w:val="false"/>
-          <w:bCs w:val="false"/>
-        </w:rPr>
-      </w:r>
-    </w:p>
-    <w:p>
-      <w:pPr>
-        <w:pStyle w:val="Normal"/>
-        <w:numPr>
-          <w:ilvl w:val="0"/>
-          <w:numId w:val="0"/>
-        </w:numPr>
-        <w:spacing w:lineRule="auto" w:line="240" w:beforeAutospacing="1" w:afterAutospacing="1"/>
-        <w:outlineLvl w:val="2"/>
-        <w:rPr>
-          <w:rFonts w:ascii="Times New Roman" w:hAnsi="Times New Roman"/>
-          <w:b w:val="false"/>
-          <w:bCs w:val="false"/>
-        </w:rPr>
-      </w:pPr>
-      <w:r>
-        <w:rPr>
-          <w:rFonts w:ascii="Times New Roman" w:hAnsi="Times New Roman"/>
-          <w:b w:val="false"/>
-          <w:bCs w:val="false"/>
-        </w:rPr>
-        <w:t>“</w:t>
-      </w:r>
-      <w:r>
-        <w:rPr>
-          <w:rFonts w:ascii="Times New Roman" w:hAnsi="Times New Roman"/>
-          <w:b w:val="false"/>
-          <w:bCs w:val="false"/>
-        </w:rPr>
-        <w:t>20260125_Gwange_F_45_mpositive_rdtnegative_yesmaker”</w:t>
-      </w:r>
-    </w:p>
-    <w:p>
-      <w:pPr>
-        <w:pStyle w:val="Normal"/>
-        <w:numPr>
-          <w:ilvl w:val="0"/>
-          <w:numId w:val="0"/>
-        </w:numPr>
-        <w:spacing w:lineRule="auto" w:line="240" w:beforeAutospacing="1" w:afterAutospacing="1"/>
-        <w:outlineLvl w:val="2"/>
-        <w:rPr>
-          <w:rFonts w:ascii="Times New Roman" w:hAnsi="Times New Roman"/>
-          <w:b w:val="false"/>
-          <w:bCs w:val="false"/>
-        </w:rPr>
-      </w:pPr>
-      <w:r>
-        <w:rPr>
-          <w:rFonts w:ascii="Times New Roman" w:hAnsi="Times New Roman"/>
-          <w:b w:val="false"/>
-          <w:bCs w:val="false"/>
-        </w:rPr>
-      </w:r>
-    </w:p>
-    <w:p>
-      <w:pPr>
-        <w:pStyle w:val="Normal"/>
-        <w:numPr>
-          <w:ilvl w:val="0"/>
-          <w:numId w:val="0"/>
-        </w:numPr>
-        <w:spacing w:lineRule="auto" w:line="240" w:beforeAutospacing="1" w:afterAutospacing="1"/>
-        <w:outlineLvl w:val="2"/>
-        <w:rPr>
-          <w:rFonts w:ascii="Times New Roman" w:hAnsi="Times New Roman"/>
-          <w:b w:val="false"/>
-          <w:bCs w:val="false"/>
-        </w:rPr>
-      </w:pPr>
-      <w:r>
-        <w:rPr>
-          <w:rFonts w:ascii="Times New Roman" w:hAnsi="Times New Roman"/>
-          <w:b w:val="false"/>
-          <w:bCs w:val="false"/>
-        </w:rPr>
-      </w:r>
-    </w:p>
-    <w:p>
-      <w:pPr>
-        <w:pStyle w:val="Normal"/>
-        <w:numPr>
-          <w:ilvl w:val="0"/>
-          <w:numId w:val="0"/>
-        </w:numPr>
-        <w:spacing w:lineRule="auto" w:line="240" w:beforeAutospacing="1" w:afterAutospacing="1"/>
-        <w:outlineLvl w:val="2"/>
-        <w:rPr>
-          <w:rFonts w:ascii="Times New Roman" w:hAnsi="Times New Roman"/>
-          <w:b/>
-          <w:bCs/>
+        <w:t>- Check the images that were sent on their subgroups and decide if they agree with the microscopy diagnose made.</w:t>
+      </w:r>
+    </w:p>
+    <w:p>
+      <w:pPr>
+        <w:pStyle w:val="Normal"/>
+        <w:numPr>
+          <w:ilvl w:val="0"/>
+          <w:numId w:val="0"/>
+        </w:numPr>
+        <w:spacing w:lineRule="auto" w:line="240" w:beforeAutospacing="1" w:afterAutospacing="1"/>
+        <w:ind w:hanging="0" w:left="0"/>
+        <w:outlineLvl w:val="2"/>
+        <w:rPr>
+          <w:rFonts w:ascii="Times New Roman" w:hAnsi="Times New Roman"/>
+          <w:b w:val="false"/>
+          <w:bCs w:val="false"/>
         </w:rPr>
       </w:pPr>
       <w:r>
         <w:rPr>
           <w:rFonts w:eastAsia="Times New Roman" w:cs="Times New Roman" w:ascii="Times New Roman" w:hAnsi="Times New Roman"/>
-          <w:b/>
-          <w:bCs/>
+          <w:b w:val="false"/>
+          <w:bCs w:val="false"/>
           <w:kern w:val="0"/>
           <w:sz w:val="27"/>
           <w:szCs w:val="27"/>
           <w14:ligatures w14:val="none"/>
         </w:rPr>
-        <w:t>5</w:t>
-      </w:r>
+        <w:t>- if they AGREE:</w:t>
+      </w:r>
+    </w:p>
+    <w:p>
+      <w:pPr>
+        <w:pStyle w:val="Normal"/>
+        <w:numPr>
+          <w:ilvl w:val="0"/>
+          <w:numId w:val="0"/>
+        </w:numPr>
+        <w:spacing w:lineRule="auto" w:line="240" w:beforeAutospacing="1" w:afterAutospacing="1"/>
+        <w:ind w:hanging="0" w:left="0"/>
+        <w:outlineLvl w:val="2"/>
+        <w:rPr>
+          <w:rFonts w:ascii="Times New Roman" w:hAnsi="Times New Roman"/>
+          <w:b w:val="false"/>
+          <w:bCs w:val="false"/>
+        </w:rPr>
+      </w:pPr>
       <w:r>
         <w:rPr>
           <w:rFonts w:eastAsia="Times New Roman" w:cs="Times New Roman" w:ascii="Times New Roman" w:hAnsi="Times New Roman"/>
-          <w:b/>
-          <w:bCs/>
+          <w:b w:val="false"/>
+          <w:bCs w:val="false"/>
           <w:kern w:val="0"/>
           <w:sz w:val="27"/>
           <w:szCs w:val="27"/>
           <w14:ligatures w14:val="none"/>
         </w:rPr>
-        <w:t>.</w:t>
-      </w:r>
+        <w:tab/>
+        <w:t>- Upload the image to the shared GoogleDrive folder and rename the image with the name that was sent as text together with the image in the previous step.</w:t>
+      </w:r>
+    </w:p>
+    <w:p>
+      <w:pPr>
+        <w:pStyle w:val="Normal"/>
+        <w:numPr>
+          <w:ilvl w:val="0"/>
+          <w:numId w:val="0"/>
+        </w:numPr>
+        <w:spacing w:lineRule="auto" w:line="240" w:beforeAutospacing="1" w:afterAutospacing="1"/>
+        <w:ind w:hanging="0" w:left="0"/>
+        <w:outlineLvl w:val="2"/>
+        <w:rPr>
+          <w:rFonts w:ascii="Times New Roman" w:hAnsi="Times New Roman"/>
+          <w:b w:val="false"/>
+          <w:bCs w:val="false"/>
+        </w:rPr>
+      </w:pPr>
       <w:r>
         <w:rPr>
           <w:rFonts w:eastAsia="Times New Roman" w:cs="Times New Roman" w:ascii="Times New Roman" w:hAnsi="Times New Roman"/>
-          <w:b/>
-          <w:bCs/>
+          <w:b w:val="false"/>
+          <w:bCs w:val="false"/>
           <w:kern w:val="0"/>
           <w:sz w:val="27"/>
           <w:szCs w:val="27"/>
           <w14:ligatures w14:val="none"/>
         </w:rPr>
-        <w:t>2</w:t>
-      </w:r>
+        <w:t>- if they DISAGREE:</w:t>
+      </w:r>
+    </w:p>
+    <w:p>
+      <w:pPr>
+        <w:pStyle w:val="Normal"/>
+        <w:numPr>
+          <w:ilvl w:val="0"/>
+          <w:numId w:val="0"/>
+        </w:numPr>
+        <w:spacing w:lineRule="auto" w:line="240" w:beforeAutospacing="1" w:afterAutospacing="1"/>
+        <w:ind w:hanging="0" w:left="0"/>
+        <w:outlineLvl w:val="2"/>
+        <w:rPr>
+          <w:rFonts w:ascii="Times New Roman" w:hAnsi="Times New Roman"/>
+        </w:rPr>
+      </w:pPr>
       <w:r>
         <w:rPr>
           <w:rFonts w:eastAsia="Times New Roman" w:cs="Times New Roman" w:ascii="Times New Roman" w:hAnsi="Times New Roman"/>
-          <w:b/>
-          <w:bCs/>
+          <w:b w:val="false"/>
+          <w:bCs w:val="false"/>
           <w:kern w:val="0"/>
           <w:sz w:val="27"/>
           <w:szCs w:val="27"/>
           <w14:ligatures w14:val="none"/>
         </w:rPr>
-        <w:t xml:space="preserve"> </w:t>
-      </w:r>
-      <w:r>
-        <w:rPr>
-          <w:rFonts w:eastAsia="Times New Roman" w:cs="Times New Roman" w:ascii="Times New Roman" w:hAnsi="Times New Roman"/>
-          <w:b/>
-          <w:bCs/>
+        <w:tab/>
+        <w:t xml:space="preserve">- give feedback on their subgroup about the image, informing why they disagree. In the case the image is inconclusive, ask if it is possible to make new images. </w:t>
+      </w:r>
+    </w:p>
+    <w:p>
+      <w:pPr>
+        <w:pStyle w:val="Normal"/>
+        <w:numPr>
+          <w:ilvl w:val="0"/>
+          <w:numId w:val="0"/>
+        </w:numPr>
+        <w:spacing w:lineRule="auto" w:line="240" w:beforeAutospacing="1" w:afterAutospacing="1"/>
+        <w:ind w:hanging="0" w:left="0"/>
+        <w:outlineLvl w:val="2"/>
+        <w:rPr>
+          <w:rFonts w:eastAsia="Times New Roman" w:cs="Times New Roman"/>
           <w:kern w:val="0"/>
           <w:sz w:val="27"/>
           <w:szCs w:val="27"/>
           <w14:ligatures w14:val="none"/>
         </w:rPr>
-        <w:t>Transferring images aquired to Gdrive</w:t>
-      </w:r>
-    </w:p>
-    <w:p>
-      <w:pPr>
-        <w:pStyle w:val="Normal"/>
-        <w:numPr>
-          <w:ilvl w:val="0"/>
-          <w:numId w:val="0"/>
-        </w:numPr>
-        <w:spacing w:lineRule="auto" w:line="240" w:beforeAutospacing="1" w:afterAutospacing="1"/>
-        <w:outlineLvl w:val="2"/>
+      </w:pPr>
+      <w:r>
         <w:rPr>
           <w:rFonts w:eastAsia="Times New Roman" w:cs="Times New Roman"/>
           <w:kern w:val="0"/>
@@ -1657,355 +1996,113 @@
           <w:szCs w:val="27"/>
           <w14:ligatures w14:val="none"/>
         </w:rPr>
-      </w:pPr>
-      <w:r>
-        <w:rPr>
-          <w:rFonts w:ascii="Times New Roman" w:hAnsi="Times New Roman"/>
-          <w:b/>
-          <w:bCs/>
-        </w:rPr>
-      </w:r>
-    </w:p>
-    <w:p>
-      <w:pPr>
-        <w:pStyle w:val="Normal"/>
-        <w:numPr>
-          <w:ilvl w:val="0"/>
-          <w:numId w:val="0"/>
-        </w:numPr>
-        <w:spacing w:lineRule="auto" w:line="240" w:beforeAutospacing="1" w:afterAutospacing="1"/>
-        <w:outlineLvl w:val="2"/>
-        <w:rPr>
-          <w:rFonts w:ascii="Times New Roman" w:hAnsi="Times New Roman"/>
-          <w:b w:val="false"/>
-          <w:bCs w:val="false"/>
-        </w:rPr>
-      </w:pPr>
-      <w:r>
-        <w:rPr>
-          <w:rFonts w:eastAsia="Times New Roman" w:cs="Times New Roman" w:ascii="Times New Roman" w:hAnsi="Times New Roman"/>
-          <w:b w:val="false"/>
-          <w:bCs w:val="false"/>
-          <w:kern w:val="0"/>
-          <w:sz w:val="27"/>
-          <w:szCs w:val="27"/>
-          <w14:ligatures w14:val="none"/>
-        </w:rPr>
-        <w:t>At this pilot stage we are adding images to a GoogleDrive folder, to serve as an initial database. For this to happen in a useful way the following steps are responsibility of the group leaders:</w:t>
-      </w:r>
-    </w:p>
-    <w:p>
-      <w:pPr>
-        <w:pStyle w:val="Normal"/>
-        <w:numPr>
-          <w:ilvl w:val="0"/>
-          <w:numId w:val="0"/>
-        </w:numPr>
-        <w:spacing w:lineRule="auto" w:line="240" w:beforeAutospacing="1" w:afterAutospacing="1"/>
-        <w:outlineLvl w:val="2"/>
-        <w:rPr>
-          <w:rFonts w:eastAsia="Times New Roman" w:cs="Times New Roman"/>
-          <w:kern w:val="0"/>
-          <w:sz w:val="27"/>
-          <w:szCs w:val="27"/>
-          <w14:ligatures w14:val="none"/>
-        </w:rPr>
-      </w:pPr>
-      <w:r>
-        <w:rPr>
-          <w:rFonts w:ascii="Times New Roman" w:hAnsi="Times New Roman"/>
-          <w:b w:val="false"/>
-          <w:bCs w:val="false"/>
-        </w:rPr>
-      </w:r>
-    </w:p>
-    <w:p>
-      <w:pPr>
-        <w:pStyle w:val="Normal"/>
-        <w:numPr>
-          <w:ilvl w:val="0"/>
-          <w:numId w:val="0"/>
-        </w:numPr>
-        <w:spacing w:lineRule="auto" w:line="240" w:beforeAutospacing="1" w:afterAutospacing="1"/>
-        <w:outlineLvl w:val="2"/>
-        <w:rPr>
-          <w:rFonts w:ascii="Times New Roman" w:hAnsi="Times New Roman"/>
-          <w:b w:val="false"/>
-          <w:bCs w:val="false"/>
-        </w:rPr>
-      </w:pPr>
-      <w:r>
-        <w:rPr>
-          <w:rFonts w:eastAsia="Times New Roman" w:cs="Times New Roman" w:ascii="Times New Roman" w:hAnsi="Times New Roman"/>
-          <w:b w:val="false"/>
-          <w:bCs w:val="false"/>
-          <w:kern w:val="0"/>
-          <w:sz w:val="27"/>
-          <w:szCs w:val="27"/>
-          <w14:ligatures w14:val="none"/>
-        </w:rPr>
-        <w:t>- Check the images that were sent on their subgroups and decide if they agree with the microscopy diagnose made.</w:t>
-      </w:r>
-    </w:p>
-    <w:p>
-      <w:pPr>
-        <w:pStyle w:val="Normal"/>
-        <w:numPr>
-          <w:ilvl w:val="0"/>
-          <w:numId w:val="0"/>
-        </w:numPr>
-        <w:spacing w:lineRule="auto" w:line="240" w:beforeAutospacing="1" w:afterAutospacing="1"/>
-        <w:outlineLvl w:val="2"/>
-        <w:rPr>
-          <w:rFonts w:ascii="Times New Roman" w:hAnsi="Times New Roman"/>
-          <w:b w:val="false"/>
-          <w:bCs w:val="false"/>
-        </w:rPr>
-      </w:pPr>
-      <w:r>
-        <w:rPr>
-          <w:rFonts w:eastAsia="Times New Roman" w:cs="Times New Roman" w:ascii="Times New Roman" w:hAnsi="Times New Roman"/>
-          <w:b w:val="false"/>
-          <w:bCs w:val="false"/>
-          <w:kern w:val="0"/>
-          <w:sz w:val="27"/>
-          <w:szCs w:val="27"/>
-          <w14:ligatures w14:val="none"/>
-        </w:rPr>
-        <w:t>- if they AGREE:</w:t>
-      </w:r>
-    </w:p>
-    <w:p>
-      <w:pPr>
-        <w:pStyle w:val="Normal"/>
-        <w:numPr>
-          <w:ilvl w:val="0"/>
-          <w:numId w:val="0"/>
-        </w:numPr>
-        <w:spacing w:lineRule="auto" w:line="240" w:beforeAutospacing="1" w:afterAutospacing="1"/>
-        <w:outlineLvl w:val="2"/>
-        <w:rPr>
-          <w:rFonts w:ascii="Times New Roman" w:hAnsi="Times New Roman"/>
-          <w:b w:val="false"/>
-          <w:bCs w:val="false"/>
-        </w:rPr>
-      </w:pPr>
-      <w:r>
-        <w:rPr>
-          <w:rFonts w:eastAsia="Times New Roman" w:cs="Times New Roman" w:ascii="Times New Roman" w:hAnsi="Times New Roman"/>
-          <w:b w:val="false"/>
-          <w:bCs w:val="false"/>
-          <w:kern w:val="0"/>
-          <w:sz w:val="27"/>
-          <w:szCs w:val="27"/>
-          <w14:ligatures w14:val="none"/>
-        </w:rPr>
-        <w:tab/>
-        <w:t>- Upload the image to the shared GoogleDrive folder and rename the image with the name that was sent as text together with the image in the previous step.</w:t>
-      </w:r>
-    </w:p>
-    <w:p>
-      <w:pPr>
-        <w:pStyle w:val="Normal"/>
-        <w:numPr>
-          <w:ilvl w:val="0"/>
-          <w:numId w:val="0"/>
-        </w:numPr>
-        <w:spacing w:lineRule="auto" w:line="240" w:beforeAutospacing="1" w:afterAutospacing="1"/>
-        <w:outlineLvl w:val="2"/>
-        <w:rPr>
-          <w:rFonts w:ascii="Times New Roman" w:hAnsi="Times New Roman"/>
-          <w:b w:val="false"/>
-          <w:bCs w:val="false"/>
-        </w:rPr>
-      </w:pPr>
-      <w:r>
-        <w:rPr>
-          <w:rFonts w:eastAsia="Times New Roman" w:cs="Times New Roman" w:ascii="Times New Roman" w:hAnsi="Times New Roman"/>
-          <w:b w:val="false"/>
-          <w:bCs w:val="false"/>
-          <w:kern w:val="0"/>
-          <w:sz w:val="27"/>
-          <w:szCs w:val="27"/>
-          <w14:ligatures w14:val="none"/>
-        </w:rPr>
-        <w:t>- if they DISAGREE:</w:t>
-      </w:r>
-    </w:p>
-    <w:p>
-      <w:pPr>
-        <w:pStyle w:val="Normal"/>
-        <w:numPr>
-          <w:ilvl w:val="0"/>
-          <w:numId w:val="0"/>
-        </w:numPr>
-        <w:spacing w:lineRule="auto" w:line="240" w:beforeAutospacing="1" w:afterAutospacing="1"/>
-        <w:outlineLvl w:val="2"/>
-        <w:rPr>
-          <w:rFonts w:ascii="Times New Roman" w:hAnsi="Times New Roman"/>
-        </w:rPr>
-      </w:pPr>
-      <w:r>
-        <w:rPr>
-          <w:rFonts w:eastAsia="Times New Roman" w:cs="Times New Roman" w:ascii="Times New Roman" w:hAnsi="Times New Roman"/>
-          <w:b w:val="false"/>
-          <w:bCs w:val="false"/>
-          <w:kern w:val="0"/>
-          <w:sz w:val="27"/>
-          <w:szCs w:val="27"/>
-          <w14:ligatures w14:val="none"/>
-        </w:rPr>
-        <w:tab/>
-        <w:t xml:space="preserve">- give feedback on their subgroup about the image, informing why </w:t>
-      </w:r>
-      <w:r>
-        <w:rPr>
-          <w:rFonts w:eastAsia="Times New Roman" w:cs="Times New Roman" w:ascii="Times New Roman" w:hAnsi="Times New Roman"/>
-          <w:b w:val="false"/>
-          <w:bCs w:val="false"/>
-          <w:kern w:val="0"/>
-          <w:sz w:val="27"/>
-          <w:szCs w:val="27"/>
-          <w14:ligatures w14:val="none"/>
-        </w:rPr>
-        <w:t>they</w:t>
-      </w:r>
-      <w:r>
-        <w:rPr>
-          <w:rFonts w:eastAsia="Times New Roman" w:cs="Times New Roman" w:ascii="Times New Roman" w:hAnsi="Times New Roman"/>
-          <w:b w:val="false"/>
-          <w:bCs w:val="false"/>
-          <w:kern w:val="0"/>
-          <w:sz w:val="27"/>
-          <w:szCs w:val="27"/>
-          <w14:ligatures w14:val="none"/>
-        </w:rPr>
-        <w:t xml:space="preserve"> disagree. In the case the image is inconclusive, ask if it is possible to make new images. </w:t>
-      </w:r>
-    </w:p>
-    <w:p>
-      <w:pPr>
-        <w:pStyle w:val="Normal"/>
-        <w:numPr>
-          <w:ilvl w:val="0"/>
-          <w:numId w:val="0"/>
-        </w:numPr>
-        <w:spacing w:lineRule="auto" w:line="240" w:beforeAutospacing="1" w:afterAutospacing="1"/>
-        <w:outlineLvl w:val="2"/>
-        <w:rPr>
-          <w:rFonts w:eastAsia="Times New Roman" w:cs="Times New Roman"/>
-          <w:kern w:val="0"/>
-          <w:sz w:val="27"/>
-          <w:szCs w:val="27"/>
-          <w14:ligatures w14:val="none"/>
-        </w:rPr>
-      </w:pPr>
-      <w:r>
-        <w:rPr>
-          <w:rFonts w:ascii="Times New Roman" w:hAnsi="Times New Roman"/>
-        </w:rPr>
-      </w:r>
-    </w:p>
-    <w:p>
-      <w:pPr>
-        <w:pStyle w:val="Normal"/>
-        <w:numPr>
-          <w:ilvl w:val="0"/>
-          <w:numId w:val="0"/>
-        </w:numPr>
-        <w:spacing w:lineRule="auto" w:line="240" w:beforeAutospacing="1" w:afterAutospacing="1"/>
-        <w:outlineLvl w:val="2"/>
-        <w:rPr>
-          <w:rFonts w:ascii="Times New Roman" w:hAnsi="Times New Roman"/>
-          <w:b w:val="false"/>
-          <w:bCs w:val="false"/>
-        </w:rPr>
-      </w:pPr>
-      <w:r>
-        <w:rPr>
-          <w:rFonts w:ascii="Times New Roman" w:hAnsi="Times New Roman"/>
-          <w:b w:val="false"/>
-          <w:bCs w:val="false"/>
-        </w:rPr>
-      </w:r>
-    </w:p>
-    <w:p>
-      <w:pPr>
-        <w:pStyle w:val="Normal"/>
-        <w:numPr>
-          <w:ilvl w:val="0"/>
-          <w:numId w:val="0"/>
-        </w:numPr>
-        <w:spacing w:lineRule="auto" w:line="240" w:beforeAutospacing="1" w:afterAutospacing="1"/>
-        <w:outlineLvl w:val="2"/>
-        <w:rPr>
-          <w:rFonts w:ascii="Times New Roman" w:hAnsi="Times New Roman"/>
-          <w:b w:val="false"/>
-          <w:bCs w:val="false"/>
-        </w:rPr>
-      </w:pPr>
-      <w:r>
-        <w:rPr>
-          <w:rFonts w:ascii="Times New Roman" w:hAnsi="Times New Roman"/>
-          <w:b w:val="false"/>
-          <w:bCs w:val="false"/>
-        </w:rPr>
-      </w:r>
-    </w:p>
-    <w:p>
-      <w:pPr>
-        <w:pStyle w:val="Normal"/>
-        <w:numPr>
-          <w:ilvl w:val="0"/>
-          <w:numId w:val="0"/>
-        </w:numPr>
-        <w:spacing w:lineRule="auto" w:line="240" w:beforeAutospacing="1" w:afterAutospacing="1"/>
-        <w:outlineLvl w:val="2"/>
-        <w:rPr>
-          <w:rFonts w:ascii="Times New Roman" w:hAnsi="Times New Roman"/>
-          <w:b w:val="false"/>
-          <w:bCs w:val="false"/>
-        </w:rPr>
-      </w:pPr>
-      <w:r>
-        <w:rPr>
-          <w:rFonts w:ascii="Times New Roman" w:hAnsi="Times New Roman"/>
-          <w:b w:val="false"/>
-          <w:bCs w:val="false"/>
-        </w:rPr>
-      </w:r>
-    </w:p>
-    <w:p>
-      <w:pPr>
-        <w:pStyle w:val="Normal"/>
-        <w:numPr>
-          <w:ilvl w:val="0"/>
-          <w:numId w:val="0"/>
-        </w:numPr>
-        <w:spacing w:lineRule="auto" w:line="240" w:beforeAutospacing="1" w:afterAutospacing="1"/>
-        <w:outlineLvl w:val="2"/>
-        <w:rPr>
-          <w:rFonts w:ascii="Times New Roman" w:hAnsi="Times New Roman"/>
-          <w:b w:val="false"/>
-          <w:bCs w:val="false"/>
-        </w:rPr>
-      </w:pPr>
-      <w:r>
-        <w:rPr>
-          <w:rFonts w:ascii="Times New Roman" w:hAnsi="Times New Roman"/>
-          <w:b w:val="false"/>
-          <w:bCs w:val="false"/>
-        </w:rPr>
-      </w:r>
-    </w:p>
-    <w:p>
-      <w:pPr>
-        <w:pStyle w:val="Normal"/>
-        <w:numPr>
-          <w:ilvl w:val="0"/>
-          <w:numId w:val="0"/>
-        </w:numPr>
-        <w:spacing w:lineRule="auto" w:line="240" w:beforeAutospacing="1" w:afterAutospacing="1"/>
+      </w:r>
+    </w:p>
+    <w:p>
+      <w:pPr>
+        <w:pStyle w:val="Normal"/>
+        <w:numPr>
+          <w:ilvl w:val="0"/>
+          <w:numId w:val="0"/>
+        </w:numPr>
+        <w:spacing w:lineRule="auto" w:line="240" w:beforeAutospacing="1" w:afterAutospacing="1"/>
+        <w:ind w:hanging="0" w:left="0"/>
+        <w:outlineLvl w:val="2"/>
+        <w:rPr>
+          <w:rFonts w:ascii="Times New Roman" w:hAnsi="Times New Roman"/>
+          <w:b w:val="false"/>
+          <w:bCs w:val="false"/>
+        </w:rPr>
+      </w:pPr>
+      <w:r>
+        <w:rPr>
+          <w:rFonts w:ascii="Times New Roman" w:hAnsi="Times New Roman"/>
+          <w:b w:val="false"/>
+          <w:bCs w:val="false"/>
+        </w:rPr>
+      </w:r>
+    </w:p>
+    <w:p>
+      <w:pPr>
+        <w:pStyle w:val="Normal"/>
+        <w:numPr>
+          <w:ilvl w:val="0"/>
+          <w:numId w:val="0"/>
+        </w:numPr>
+        <w:spacing w:lineRule="auto" w:line="240" w:beforeAutospacing="1" w:afterAutospacing="1"/>
+        <w:ind w:hanging="0" w:left="0"/>
+        <w:outlineLvl w:val="2"/>
+        <w:rPr>
+          <w:rFonts w:ascii="Times New Roman" w:hAnsi="Times New Roman"/>
+          <w:b w:val="false"/>
+          <w:bCs w:val="false"/>
+        </w:rPr>
+      </w:pPr>
+      <w:r>
+        <w:rPr>
+          <w:rFonts w:ascii="Times New Roman" w:hAnsi="Times New Roman"/>
+          <w:b w:val="false"/>
+          <w:bCs w:val="false"/>
+        </w:rPr>
+      </w:r>
+    </w:p>
+    <w:p>
+      <w:pPr>
+        <w:pStyle w:val="Normal"/>
+        <w:numPr>
+          <w:ilvl w:val="0"/>
+          <w:numId w:val="0"/>
+        </w:numPr>
+        <w:spacing w:lineRule="auto" w:line="240" w:beforeAutospacing="1" w:afterAutospacing="1"/>
+        <w:ind w:hanging="0" w:left="0"/>
+        <w:outlineLvl w:val="2"/>
+        <w:rPr>
+          <w:rFonts w:ascii="Times New Roman" w:hAnsi="Times New Roman"/>
+          <w:b w:val="false"/>
+          <w:bCs w:val="false"/>
+        </w:rPr>
+      </w:pPr>
+      <w:r>
+        <w:rPr>
+          <w:rFonts w:ascii="Times New Roman" w:hAnsi="Times New Roman"/>
+          <w:b w:val="false"/>
+          <w:bCs w:val="false"/>
+        </w:rPr>
+      </w:r>
+    </w:p>
+    <w:p>
+      <w:pPr>
+        <w:pStyle w:val="Normal"/>
+        <w:numPr>
+          <w:ilvl w:val="0"/>
+          <w:numId w:val="0"/>
+        </w:numPr>
+        <w:spacing w:lineRule="auto" w:line="240" w:beforeAutospacing="1" w:afterAutospacing="1"/>
+        <w:ind w:hanging="0" w:left="0"/>
+        <w:outlineLvl w:val="2"/>
+        <w:rPr>
+          <w:rFonts w:ascii="Times New Roman" w:hAnsi="Times New Roman"/>
+          <w:b w:val="false"/>
+          <w:bCs w:val="false"/>
+        </w:rPr>
+      </w:pPr>
+      <w:r>
+        <w:rPr>
+          <w:rFonts w:ascii="Times New Roman" w:hAnsi="Times New Roman"/>
+          <w:b w:val="false"/>
+          <w:bCs w:val="false"/>
+        </w:rPr>
+      </w:r>
+    </w:p>
+    <w:p>
+      <w:pPr>
+        <w:pStyle w:val="Normal"/>
+        <w:numPr>
+          <w:ilvl w:val="0"/>
+          <w:numId w:val="0"/>
+        </w:numPr>
+        <w:spacing w:lineRule="auto" w:line="240" w:beforeAutospacing="1" w:afterAutospacing="1"/>
+        <w:ind w:hanging="0" w:left="0"/>
         <w:outlineLvl w:val="2"/>
         <w:rPr>
           <w:rFonts w:ascii="Times New Roman" w:hAnsi="Times New Roman"/>
@@ -2876,6 +2973,7 @@
     <w:qFormat/>
     <w:pPr>
       <w:widowControl/>
+      <w:suppressAutoHyphens w:val="true"/>
       <w:bidi w:val="0"/>
       <w:spacing w:lineRule="auto" w:line="276" w:before="0" w:after="160"/>
       <w:jc w:val="left"/>

</xml_diff>